<commit_message>
docs: remover Romero Labs de la empresa desarrolladora, mantener CivicLoop Technologies S.A.
</commit_message>
<xml_diff>
--- a/Proyecto Final Integrador - EcoMapa V2.1.docx
+++ b/Proyecto Final Integrador - EcoMapa V2.1.docx
@@ -180,7 +180,7 @@
                 <w:color w:val="191C1E"/>
                 <w:sz w:val="20"/>
               </w:rPr>
-              <w:t>CivicLoop Technologies S.A. / Romero Labs</w:t>
+              <w:t>CivicLoop Technologies S.A.</w:t>
             </w:r>
           </w:p>
         </w:tc>
@@ -13921,7 +13921,7 @@
           <w:color w:val="006C49"/>
           <w:sz w:val="20"/>
         </w:rPr>
-        <w:t>CivicLoop Technologies S.A. &amp; Romero Labs</w:t>
+        <w:t>CivicLoop Technologies S.A.</w:t>
         <w:br/>
         <w:t>Villa del Rosario, Córdoba — Ciclo Lectivo 2026</w:t>
       </w:r>

</xml_diff>